<commit_message>
Research documant and some adjustmens
</commit_message>
<xml_diff>
--- a/DA, Purposal/Proposalfor Bike rentals predictor (Daily Forecast).docx
+++ b/DA, Purposal/Proposalfor Bike rentals predictor (Daily Forecast).docx
@@ -1501,6 +1501,9 @@
       <w:r>
         <w:t>temperature, humidity, windspeed</w:t>
       </w:r>
+      <w:r>
+        <w:t>, rainfall</w:t>
+      </w:r>
     </w:p>
     <w:p>
       <w:pPr>
@@ -1523,6 +1526,9 @@
       <w:r>
         <w:t>season, month, weekday, hour</w:t>
       </w:r>
+      <w:r>
+        <w:t>, date, holiday</w:t>
+      </w:r>
     </w:p>
     <w:p>
       <w:pPr>
@@ -1994,22 +2000,6 @@
       <w:r>
         <w:t>Categorical variables properly encoded.</w:t>
       </w:r>
-    </w:p>
-    <w:p>
-      <w:pPr>
-        <w:numPr>
-          <w:ilvl w:val="1"/>
-          <w:numId w:val="12"/>
-        </w:numPr>
-      </w:pPr>
-      <w:r>
-        <w:t>Aggregation from hourly data into daily forecasts must be consistent.</w:t>
-      </w:r>
-    </w:p>
-    <w:p>
-      <w:pPr>
-        <w:ind w:left="1080"/>
-      </w:pPr>
     </w:p>
     <w:p>
       <w:pPr>

</xml_diff>